<commit_message>
Updated report with deployment and repo links
</commit_message>
<xml_diff>
--- a/report/Project_Report.docx
+++ b/report/Project_Report.docx
@@ -308,7 +308,7 @@
           <w:szCs w:val="32"/>
         </w:rPr>
         <w:pict w14:anchorId="4571BF58">
-          <v:rect id="_x0000_i1103" style="width:0;height:1.5pt" o:hralign="center" o:hrstd="t" o:hr="t" fillcolor="#a0a0a0" stroked="f"/>
+          <v:rect id="_x0000_i1025" style="width:0;height:1.5pt" o:hralign="center" o:hrstd="t" o:hr="t" fillcolor="#a0a0a0" stroked="f"/>
         </w:pict>
       </w:r>
     </w:p>
@@ -365,7 +365,7 @@
           <w:szCs w:val="32"/>
         </w:rPr>
         <w:pict w14:anchorId="37C67C78">
-          <v:rect id="_x0000_i1104" style="width:0;height:1.5pt" o:hralign="center" o:hrstd="t" o:hr="t" fillcolor="#a0a0a0" stroked="f"/>
+          <v:rect id="_x0000_i1026" style="width:0;height:1.5pt" o:hralign="center" o:hrstd="t" o:hr="t" fillcolor="#a0a0a0" stroked="f"/>
         </w:pict>
       </w:r>
     </w:p>
@@ -415,7 +415,7 @@
           <w:szCs w:val="32"/>
         </w:rPr>
         <w:pict w14:anchorId="54A1D7D7">
-          <v:rect id="_x0000_i1116" style="width:0;height:1.5pt" o:hralign="center" o:hrstd="t" o:hr="t" fillcolor="#a0a0a0" stroked="f"/>
+          <v:rect id="_x0000_i1027" style="width:0;height:1.5pt" o:hralign="center" o:hrstd="t" o:hr="t" fillcolor="#a0a0a0" stroked="f"/>
         </w:pict>
       </w:r>
     </w:p>
@@ -469,7 +469,7 @@
           <w:szCs w:val="32"/>
         </w:rPr>
         <w:pict w14:anchorId="5FE2418C">
-          <v:rect id="_x0000_i1106" style="width:0;height:1.5pt" o:hralign="center" o:hrstd="t" o:hr="t" fillcolor="#a0a0a0" stroked="f"/>
+          <v:rect id="_x0000_i1028" style="width:0;height:1.5pt" o:hralign="center" o:hrstd="t" o:hr="t" fillcolor="#a0a0a0" stroked="f"/>
         </w:pict>
       </w:r>
     </w:p>
@@ -547,7 +547,7 @@
           <w:szCs w:val="32"/>
         </w:rPr>
         <w:pict w14:anchorId="05F98E06">
-          <v:rect id="_x0000_i1107" style="width:0;height:1.5pt" o:hralign="center" o:hrstd="t" o:hr="t" fillcolor="#a0a0a0" stroked="f"/>
+          <v:rect id="_x0000_i1029" style="width:0;height:1.5pt" o:hralign="center" o:hrstd="t" o:hr="t" fillcolor="#a0a0a0" stroked="f"/>
         </w:pict>
       </w:r>
     </w:p>
@@ -6099,16 +6099,7 @@
                 <w:sz w:val="20"/>
                 <w:szCs w:val="20"/>
               </w:rPr>
-              <w:t xml:space="preserve">     </w:t>
-            </w:r>
-            <w:r>
-              <w:rPr>
-                <w:b/>
-                <w:bCs/>
-                <w:sz w:val="20"/>
-                <w:szCs w:val="20"/>
-              </w:rPr>
-              <w:t>Value</w:t>
+              <w:t xml:space="preserve">     Value</w:t>
             </w:r>
           </w:p>
         </w:tc>
@@ -6157,14 +6148,7 @@
                 <w:sz w:val="20"/>
                 <w:szCs w:val="20"/>
               </w:rPr>
-              <w:t xml:space="preserve">     </w:t>
-            </w:r>
-            <w:r>
-              <w:rPr>
-                <w:sz w:val="20"/>
-                <w:szCs w:val="20"/>
-              </w:rPr>
-              <w:t>88.8%</w:t>
+              <w:t xml:space="preserve">     88.8%</w:t>
             </w:r>
           </w:p>
         </w:tc>
@@ -6213,14 +6197,7 @@
                 <w:sz w:val="20"/>
                 <w:szCs w:val="20"/>
               </w:rPr>
-              <w:t xml:space="preserve">     </w:t>
-            </w:r>
-            <w:r>
-              <w:rPr>
-                <w:sz w:val="20"/>
-                <w:szCs w:val="20"/>
-              </w:rPr>
-              <w:t>47%</w:t>
+              <w:t xml:space="preserve">     47%</w:t>
             </w:r>
           </w:p>
         </w:tc>
@@ -6269,14 +6246,7 @@
                 <w:sz w:val="20"/>
                 <w:szCs w:val="20"/>
               </w:rPr>
-              <w:t xml:space="preserve">     </w:t>
-            </w:r>
-            <w:r>
-              <w:rPr>
-                <w:sz w:val="20"/>
-                <w:szCs w:val="20"/>
-              </w:rPr>
-              <w:t>1%</w:t>
+              <w:t xml:space="preserve">     1%</w:t>
             </w:r>
           </w:p>
         </w:tc>
@@ -6325,14 +6295,7 @@
                 <w:sz w:val="20"/>
                 <w:szCs w:val="20"/>
               </w:rPr>
-              <w:t xml:space="preserve">      </w:t>
-            </w:r>
-            <w:r>
-              <w:rPr>
-                <w:sz w:val="20"/>
-                <w:szCs w:val="20"/>
-              </w:rPr>
-              <w:t>2%</w:t>
+              <w:t xml:space="preserve">      2%</w:t>
             </w:r>
           </w:p>
         </w:tc>
@@ -6878,50 +6841,22 @@
           <w:sz w:val="20"/>
           <w:szCs w:val="20"/>
         </w:rPr>
-        <w:t>[[12178</w:t>
-      </w:r>
-      <w:r>
+        <w:t>[[12178   5905]</w:t>
+      </w:r>
+    </w:p>
+    <w:p>
+      <w:pPr>
         <w:rPr>
           <w:sz w:val="20"/>
           <w:szCs w:val="20"/>
         </w:rPr>
-        <w:t xml:space="preserve"> </w:t>
-      </w:r>
+      </w:pPr>
       <w:r>
         <w:rPr>
           <w:sz w:val="20"/>
           <w:szCs w:val="20"/>
         </w:rPr>
-        <w:t xml:space="preserve">  5905]</w:t>
-      </w:r>
-    </w:p>
-    <w:p>
-      <w:pPr>
-        <w:rPr>
-          <w:sz w:val="20"/>
-          <w:szCs w:val="20"/>
-        </w:rPr>
-      </w:pPr>
-      <w:r>
-        <w:rPr>
-          <w:sz w:val="20"/>
-          <w:szCs w:val="20"/>
-        </w:rPr>
-        <w:t xml:space="preserve"> [ 1050</w:t>
-      </w:r>
-      <w:r>
-        <w:rPr>
-          <w:sz w:val="20"/>
-          <w:szCs w:val="20"/>
-        </w:rPr>
-        <w:t xml:space="preserve">   </w:t>
-      </w:r>
-      <w:r>
-        <w:rPr>
-          <w:sz w:val="20"/>
-          <w:szCs w:val="20"/>
-        </w:rPr>
-        <w:t xml:space="preserve"> 1221]]</w:t>
+        <w:t xml:space="preserve"> [ 1050    1221]]</w:t>
       </w:r>
     </w:p>
     <w:p>
@@ -11050,9 +10985,14 @@
       </w:r>
     </w:p>
     <w:p>
-      <w:r>
-        <w:t>[Insert GitHub Repository URL]</w:t>
-      </w:r>
+      <w:hyperlink r:id="rId18" w:history="1">
+        <w:r>
+          <w:rPr>
+            <w:rStyle w:val="Hyperlink"/>
+          </w:rPr>
+          <w:t>JaiSurya07-Peace</w:t>
+        </w:r>
+      </w:hyperlink>
     </w:p>
     <w:p>
       <w:pPr>
@@ -11070,9 +11010,14 @@
       </w:r>
     </w:p>
     <w:p>
-      <w:r>
-        <w:t>[Insert Streamlit Deployment URL]</w:t>
-      </w:r>
+      <w:hyperlink r:id="rId19" w:history="1">
+        <w:r>
+          <w:rPr>
+            <w:rStyle w:val="Hyperlink"/>
+          </w:rPr>
+          <w:t>AI-Powered Hospital Readmission Risk Predictor</w:t>
+        </w:r>
+      </w:hyperlink>
     </w:p>
     <w:p>
       <w:pPr>
@@ -15741,6 +15686,7 @@
   <w:style w:type="character" w:default="1" w:styleId="DefaultParagraphFont">
     <w:name w:val="Default Paragraph Font"/>
     <w:uiPriority w:val="1"/>
+    <w:semiHidden/>
     <w:unhideWhenUsed/>
   </w:style>
   <w:style w:type="table" w:default="1" w:styleId="TableNormal">

</xml_diff>

<commit_message>
Added linkedin post url and changed trainer and guides names in the documentaion
</commit_message>
<xml_diff>
--- a/report/Project_Report.docx
+++ b/report/Project_Report.docx
@@ -338,12 +338,10 @@
     </w:p>
     <w:p>
       <w:proofErr w:type="spellStart"/>
-      <w:proofErr w:type="gramStart"/>
       <w:r>
         <w:t>B.Tech</w:t>
       </w:r>
       <w:proofErr w:type="spellEnd"/>
-      <w:proofErr w:type="gramEnd"/>
       <w:r>
         <w:t xml:space="preserve"> – Artificial Intelligence and Machine Learning</w:t>
       </w:r>
@@ -390,13 +388,35 @@
     </w:p>
     <w:p>
       <w:r>
-        <w:t>M. Ruthu</w:t>
-      </w:r>
+        <w:t>M</w:t>
+      </w:r>
+      <w:r>
+        <w:t>eda</w:t>
+      </w:r>
+      <w:r>
+        <w:t xml:space="preserve"> </w:t>
+      </w:r>
+      <w:proofErr w:type="spellStart"/>
+      <w:r>
+        <w:t>Ruthu</w:t>
+      </w:r>
+      <w:r>
+        <w:t>mma</w:t>
+      </w:r>
+      <w:proofErr w:type="spellEnd"/>
     </w:p>
     <w:p>
       <w:r>
         <w:t>Revathi Devi</w:t>
       </w:r>
+      <w:r>
+        <w:t xml:space="preserve"> </w:t>
+      </w:r>
+      <w:proofErr w:type="spellStart"/>
+      <w:r>
+        <w:t>Yelamanchili</w:t>
+      </w:r>
+      <w:proofErr w:type="spellEnd"/>
     </w:p>
     <w:p>
       <w:pPr>
@@ -611,8 +631,38 @@
           <w:b/>
           <w:bCs/>
         </w:rPr>
-        <w:t>M Ruthu</w:t>
-      </w:r>
+        <w:t>M</w:t>
+      </w:r>
+      <w:r>
+        <w:rPr>
+          <w:b/>
+          <w:bCs/>
+        </w:rPr>
+        <w:t>eda</w:t>
+      </w:r>
+      <w:r>
+        <w:rPr>
+          <w:b/>
+          <w:bCs/>
+        </w:rPr>
+        <w:t xml:space="preserve"> </w:t>
+      </w:r>
+      <w:proofErr w:type="spellStart"/>
+      <w:r>
+        <w:rPr>
+          <w:b/>
+          <w:bCs/>
+        </w:rPr>
+        <w:t>Ruthu</w:t>
+      </w:r>
+      <w:r>
+        <w:rPr>
+          <w:b/>
+          <w:bCs/>
+        </w:rPr>
+        <w:t>mma</w:t>
+      </w:r>
+      <w:proofErr w:type="spellEnd"/>
       <w:r>
         <w:t xml:space="preserve">, </w:t>
       </w:r>
@@ -626,6 +676,22 @@
         </w:rPr>
         <w:t>Revathi Devi</w:t>
       </w:r>
+      <w:r>
+        <w:rPr>
+          <w:b/>
+          <w:bCs/>
+        </w:rPr>
+        <w:t xml:space="preserve"> </w:t>
+      </w:r>
+      <w:proofErr w:type="spellStart"/>
+      <w:r>
+        <w:rPr>
+          <w:b/>
+          <w:bCs/>
+        </w:rPr>
+        <w:t>Yelamanchili</w:t>
+      </w:r>
+      <w:proofErr w:type="spellEnd"/>
       <w:r>
         <w:rPr>
           <w:b/>
@@ -1803,12 +1869,10 @@
         <w:t xml:space="preserve">This dataset was selected due to its large number of patient records, diverse healthcare attributes, and relevance to hospital readmission analysis. Its demographic, </w:t>
       </w:r>
       <w:proofErr w:type="spellStart"/>
-      <w:proofErr w:type="gramStart"/>
       <w:r>
         <w:t>clinical,hospitalization</w:t>
       </w:r>
       <w:proofErr w:type="spellEnd"/>
-      <w:proofErr w:type="gramEnd"/>
       <w:r>
         <w:t>, and medication-related features make it suitable for developing Machine Learning models for readmission risk prediction.</w:t>
       </w:r>
@@ -4389,21 +4453,8 @@
       </w:r>
     </w:p>
     <w:p>
-      <w:proofErr w:type="gramStart"/>
-      <w:r>
-        <w:t>df.isnull</w:t>
-      </w:r>
-      <w:proofErr w:type="gramEnd"/>
-      <w:r>
-        <w:t>(</w:t>
-      </w:r>
-      <w:proofErr w:type="gramStart"/>
-      <w:r>
-        <w:t>).sum</w:t>
-      </w:r>
-      <w:proofErr w:type="gramEnd"/>
-      <w:r>
-        <w:t>()</w:t>
+      <w:r>
+        <w:t>df.isnull().sum()</w:t>
       </w:r>
     </w:p>
     <w:p/>
@@ -4695,7 +4746,6 @@
         <w:t xml:space="preserve"> = </w:t>
       </w:r>
       <w:proofErr w:type="spellStart"/>
-      <w:proofErr w:type="gramStart"/>
       <w:r>
         <w:rPr>
           <w:sz w:val="20"/>
@@ -4704,23 +4754,22 @@
         <w:t>df.drop</w:t>
       </w:r>
       <w:proofErr w:type="spellEnd"/>
-      <w:proofErr w:type="gramEnd"/>
       <w:r>
         <w:rPr>
           <w:sz w:val="20"/>
           <w:szCs w:val="20"/>
         </w:rPr>
-        <w:t>(columns</w:t>
-      </w:r>
-      <w:proofErr w:type="gramStart"/>
+        <w:t>(columns=['</w:t>
+      </w:r>
+      <w:proofErr w:type="spellStart"/>
       <w:r>
         <w:rPr>
           <w:sz w:val="20"/>
           <w:szCs w:val="20"/>
         </w:rPr>
-        <w:t>=[</w:t>
-      </w:r>
-      <w:proofErr w:type="gramEnd"/>
+        <w:t>encounter_id</w:t>
+      </w:r>
+      <w:proofErr w:type="spellEnd"/>
       <w:r>
         <w:rPr>
           <w:sz w:val="20"/>
@@ -4728,15 +4777,13 @@
         </w:rPr>
         <w:t>'</w:t>
       </w:r>
-      <w:proofErr w:type="spellStart"/>
       <w:r>
         <w:rPr>
           <w:sz w:val="20"/>
           <w:szCs w:val="20"/>
         </w:rPr>
-        <w:t>encounter_id</w:t>
-      </w:r>
-      <w:proofErr w:type="spellEnd"/>
+        <w:t xml:space="preserve">, </w:t>
+      </w:r>
       <w:r>
         <w:rPr>
           <w:sz w:val="20"/>
@@ -4744,19 +4791,21 @@
         </w:rPr>
         <w:t>'</w:t>
       </w:r>
+      <w:proofErr w:type="spellStart"/>
       <w:r>
         <w:rPr>
           <w:sz w:val="20"/>
           <w:szCs w:val="20"/>
         </w:rPr>
-        <w:t xml:space="preserve">, </w:t>
-      </w:r>
+        <w:t>patient_nbr</w:t>
+      </w:r>
+      <w:proofErr w:type="spellEnd"/>
       <w:r>
         <w:rPr>
           <w:sz w:val="20"/>
           <w:szCs w:val="20"/>
         </w:rPr>
-        <w:t>'</w:t>
+        <w:t>', '</w:t>
       </w:r>
       <w:proofErr w:type="spellStart"/>
       <w:r>
@@ -4764,7 +4813,7 @@
           <w:sz w:val="20"/>
           <w:szCs w:val="20"/>
         </w:rPr>
-        <w:t>patient_nbr</w:t>
+        <w:t>weight','readmitted</w:t>
       </w:r>
       <w:proofErr w:type="spellEnd"/>
       <w:r>
@@ -4772,37 +4821,37 @@
           <w:sz w:val="20"/>
           <w:szCs w:val="20"/>
         </w:rPr>
-        <w:t>', '</w:t>
-      </w:r>
-      <w:proofErr w:type="spellStart"/>
+        <w:t>'</w:t>
+      </w:r>
       <w:r>
         <w:rPr>
           <w:sz w:val="20"/>
           <w:szCs w:val="20"/>
         </w:rPr>
-        <w:t>weight','readmitted</w:t>
-      </w:r>
-      <w:proofErr w:type="spellEnd"/>
+        <w:t>,</w:t>
+      </w:r>
       <w:r>
         <w:rPr>
           <w:sz w:val="20"/>
           <w:szCs w:val="20"/>
         </w:rPr>
-        <w:t>'</w:t>
-      </w:r>
+        <w:t xml:space="preserve"> 'max_glu_serum','diag_1','diag_2','diag_3', '</w:t>
+      </w:r>
+      <w:proofErr w:type="spellStart"/>
       <w:r>
         <w:rPr>
           <w:sz w:val="20"/>
           <w:szCs w:val="20"/>
         </w:rPr>
-        <w:t>,</w:t>
-      </w:r>
+        <w:t>citoglipton</w:t>
+      </w:r>
+      <w:proofErr w:type="spellEnd"/>
       <w:r>
         <w:rPr>
           <w:sz w:val="20"/>
           <w:szCs w:val="20"/>
         </w:rPr>
-        <w:t xml:space="preserve"> 'max_glu_serum','diag_1','diag_2','diag_3', '</w:t>
+        <w:t>',  '</w:t>
       </w:r>
       <w:proofErr w:type="spellStart"/>
       <w:r>
@@ -4810,260 +4859,258 @@
           <w:sz w:val="20"/>
           <w:szCs w:val="20"/>
         </w:rPr>
-        <w:t>citoglipton</w:t>
+        <w:t>examide</w:t>
       </w:r>
       <w:proofErr w:type="spellEnd"/>
-      <w:proofErr w:type="gramStart"/>
       <w:r>
         <w:rPr>
           <w:sz w:val="20"/>
           <w:szCs w:val="20"/>
         </w:rPr>
-        <w:t>',  '</w:t>
-      </w:r>
-      <w:proofErr w:type="spellStart"/>
-      <w:proofErr w:type="gramEnd"/>
+        <w:t>','acetohexamide', 'troglitazone',    'glimepiride-pioglitazone', 'metformin-pioglitazone',</w:t>
+      </w:r>
       <w:r>
         <w:rPr>
           <w:sz w:val="20"/>
           <w:szCs w:val="20"/>
         </w:rPr>
-        <w:t>examide</w:t>
-      </w:r>
-      <w:proofErr w:type="spellEnd"/>
+        <w:t xml:space="preserve"> </w:t>
+      </w:r>
       <w:r>
         <w:rPr>
           <w:sz w:val="20"/>
           <w:szCs w:val="20"/>
         </w:rPr>
-        <w:t>','acetohexamide', 'troglitazone</w:t>
-      </w:r>
-      <w:proofErr w:type="gramStart"/>
+        <w:t>'metformin-rosiglitazone', 'tolbutamide'</w:t>
+      </w:r>
       <w:r>
         <w:rPr>
           <w:sz w:val="20"/>
           <w:szCs w:val="20"/>
         </w:rPr>
-        <w:t xml:space="preserve">',   </w:t>
-      </w:r>
-      <w:proofErr w:type="gramEnd"/>
+        <w:t>,</w:t>
+      </w:r>
       <w:r>
         <w:rPr>
           <w:sz w:val="20"/>
           <w:szCs w:val="20"/>
         </w:rPr>
-        <w:t xml:space="preserve"> 'glimepiride-pioglitazone', 'metformin-pioglitazone',</w:t>
-      </w:r>
-      <w:r>
+        <w:t xml:space="preserve"> 'glipizide-metformin', 'tolazamide', 'glyburide-metformin'])</w:t>
+      </w:r>
+    </w:p>
+    <w:p>
+      <w:pPr>
         <w:rPr>
           <w:sz w:val="20"/>
           <w:szCs w:val="20"/>
         </w:rPr>
-        <w:t xml:space="preserve"> </w:t>
-      </w:r>
-      <w:r>
+      </w:pPr>
+    </w:p>
+    <w:p>
+      <w:pPr>
+        <w:rPr>
+          <w:b/>
+          <w:bCs/>
+          <w:sz w:val="28"/>
+          <w:szCs w:val="28"/>
+        </w:rPr>
+      </w:pPr>
+      <w:r>
+        <w:rPr>
+          <w:b/>
+          <w:bCs/>
+          <w:sz w:val="28"/>
+          <w:szCs w:val="28"/>
+        </w:rPr>
+        <w:t>HANDLING UNKNOWN VALUES</w:t>
+      </w:r>
+    </w:p>
+    <w:p>
+      <w:r>
+        <w:t xml:space="preserve">During data inspection, several categorical features contained the symbol </w:t>
+      </w:r>
+      <w:r>
+        <w:rPr>
+          <w:b/>
+          <w:bCs/>
+        </w:rPr>
+        <w:t>'?'</w:t>
+      </w:r>
+      <w:r>
+        <w:t>, which represented unknown or unavailable information. These values could not be directly processed by Machine Learning algorithms and therefore required special handling.</w:t>
+      </w:r>
+    </w:p>
+    <w:p>
+      <w:r>
+        <w:t>A detailed analysis was performed to identify columns containing unknown values. Instead of removing the affected records, the unknown entries were treated as a separate category to preserve valuable patient information and prevent unnecessary data loss.</w:t>
+      </w:r>
+    </w:p>
+    <w:p>
+      <w:r>
+        <w:t xml:space="preserve">For features such as </w:t>
+      </w:r>
+      <w:r>
+        <w:rPr>
+          <w:b/>
+          <w:bCs/>
+        </w:rPr>
+        <w:t>race</w:t>
+      </w:r>
+      <w:r>
+        <w:t xml:space="preserve">, </w:t>
+      </w:r>
+      <w:proofErr w:type="spellStart"/>
+      <w:r>
+        <w:rPr>
+          <w:b/>
+          <w:bCs/>
+        </w:rPr>
+        <w:t>payer_code</w:t>
+      </w:r>
+      <w:proofErr w:type="spellEnd"/>
+      <w:r>
+        <w:t xml:space="preserve">, and </w:t>
+      </w:r>
+      <w:proofErr w:type="spellStart"/>
+      <w:r>
+        <w:rPr>
+          <w:b/>
+          <w:bCs/>
+        </w:rPr>
+        <w:t>medical_specialty</w:t>
+      </w:r>
+      <w:proofErr w:type="spellEnd"/>
+      <w:r>
+        <w:t xml:space="preserve">, the '?' values were replaced with </w:t>
+      </w:r>
+      <w:r>
+        <w:rPr>
+          <w:b/>
+          <w:bCs/>
+        </w:rPr>
+        <w:t>'Unknown'</w:t>
+      </w:r>
+      <w:r>
+        <w:t>. This approach allowed the models to learn potential patterns associated with missing information while maintaining the integrity of the dataset.</w:t>
+      </w:r>
+    </w:p>
+    <w:p>
+      <w:pPr>
+        <w:rPr>
+          <w:b/>
+          <w:bCs/>
+        </w:rPr>
+      </w:pPr>
+      <w:r>
+        <w:rPr>
+          <w:b/>
+          <w:bCs/>
+        </w:rPr>
+        <w:t>Code Snippet</w:t>
+      </w:r>
+    </w:p>
+    <w:p>
+      <w:pPr>
         <w:rPr>
           <w:sz w:val="20"/>
           <w:szCs w:val="20"/>
         </w:rPr>
-        <w:t>'metformin-rosiglitazone', 'tolbutamide'</w:t>
-      </w:r>
+      </w:pPr>
+      <w:proofErr w:type="spellStart"/>
       <w:r>
         <w:rPr>
           <w:sz w:val="20"/>
           <w:szCs w:val="20"/>
         </w:rPr>
-        <w:t>,</w:t>
-      </w:r>
+        <w:t>df</w:t>
+      </w:r>
+      <w:proofErr w:type="spellEnd"/>
       <w:r>
         <w:rPr>
           <w:sz w:val="20"/>
           <w:szCs w:val="20"/>
         </w:rPr>
-        <w:t xml:space="preserve"> 'glipizide-metformin', 'tolazamide', 'glyburide-metformin'])</w:t>
-      </w:r>
-    </w:p>
-    <w:p>
-      <w:pPr>
+        <w:t xml:space="preserve">['race'] = </w:t>
+      </w:r>
+      <w:proofErr w:type="spellStart"/>
+      <w:r>
         <w:rPr>
           <w:sz w:val="20"/>
           <w:szCs w:val="20"/>
         </w:rPr>
-      </w:pPr>
-    </w:p>
-    <w:p>
-      <w:pPr>
-        <w:rPr>
-          <w:b/>
-          <w:bCs/>
-          <w:sz w:val="28"/>
-          <w:szCs w:val="28"/>
-        </w:rPr>
-      </w:pPr>
-      <w:r>
-        <w:rPr>
-          <w:b/>
-          <w:bCs/>
-          <w:sz w:val="28"/>
-          <w:szCs w:val="28"/>
-        </w:rPr>
-        <w:t>HANDLING UNKNOWN VALUES</w:t>
-      </w:r>
-    </w:p>
-    <w:p>
-      <w:r>
-        <w:t xml:space="preserve">During data inspection, several categorical features contained the symbol </w:t>
-      </w:r>
-      <w:r>
-        <w:rPr>
-          <w:b/>
-          <w:bCs/>
-        </w:rPr>
-        <w:t>'?'</w:t>
-      </w:r>
-      <w:r>
-        <w:t>, which represented unknown or unavailable information. These values could not be directly processed by Machine Learning algorithms and therefore required special handling.</w:t>
-      </w:r>
-    </w:p>
-    <w:p>
-      <w:r>
-        <w:t>A detailed analysis was performed to identify columns containing unknown values. Instead of removing the affected records, the unknown entries were treated as a separate category to preserve valuable patient information and prevent unnecessary data loss.</w:t>
-      </w:r>
-    </w:p>
-    <w:p>
-      <w:r>
-        <w:t xml:space="preserve">For features such as </w:t>
-      </w:r>
-      <w:r>
-        <w:rPr>
-          <w:b/>
-          <w:bCs/>
-        </w:rPr>
-        <w:t>race</w:t>
-      </w:r>
-      <w:r>
-        <w:t xml:space="preserve">, </w:t>
-      </w:r>
-      <w:proofErr w:type="spellStart"/>
-      <w:r>
-        <w:rPr>
-          <w:b/>
-          <w:bCs/>
-        </w:rPr>
-        <w:t>payer_code</w:t>
+        <w:t>df</w:t>
       </w:r>
       <w:proofErr w:type="spellEnd"/>
       <w:r>
-        <w:t xml:space="preserve">, and </w:t>
-      </w:r>
-      <w:proofErr w:type="spellStart"/>
-      <w:r>
-        <w:rPr>
-          <w:b/>
-          <w:bCs/>
-        </w:rPr>
-        <w:t>medical_specialty</w:t>
-      </w:r>
-      <w:proofErr w:type="spellEnd"/>
-      <w:r>
-        <w:t xml:space="preserve">, the '?' values were replaced with </w:t>
-      </w:r>
-      <w:r>
-        <w:rPr>
-          <w:b/>
-          <w:bCs/>
-        </w:rPr>
-        <w:t>'Unknown'</w:t>
-      </w:r>
-      <w:r>
-        <w:t>. This approach allowed the models to learn potential patterns associated with missing information while maintaining the integrity of the dataset.</w:t>
-      </w:r>
-    </w:p>
-    <w:p>
-      <w:pPr>
-        <w:rPr>
-          <w:b/>
-          <w:bCs/>
-        </w:rPr>
-      </w:pPr>
-      <w:r>
-        <w:rPr>
-          <w:b/>
-          <w:bCs/>
-        </w:rPr>
-        <w:t>Code Snippet</w:t>
-      </w:r>
-    </w:p>
-    <w:p>
-      <w:pPr>
         <w:rPr>
           <w:sz w:val="20"/>
           <w:szCs w:val="20"/>
         </w:rPr>
-      </w:pPr>
-      <w:proofErr w:type="spellStart"/>
-      <w:r>
+        <w:t>['race'].replace('?', 'Unknown')</w:t>
+      </w:r>
+    </w:p>
+    <w:p>
+      <w:pPr>
         <w:rPr>
           <w:sz w:val="20"/>
           <w:szCs w:val="20"/>
         </w:rPr>
-        <w:t>df</w:t>
-      </w:r>
-      <w:proofErr w:type="spellEnd"/>
+      </w:pPr>
+      <w:proofErr w:type="spellStart"/>
       <w:r>
         <w:rPr>
           <w:sz w:val="20"/>
           <w:szCs w:val="20"/>
         </w:rPr>
-        <w:t xml:space="preserve">['race'] = </w:t>
-      </w:r>
-      <w:proofErr w:type="spellStart"/>
+        <w:t>df</w:t>
+      </w:r>
+      <w:proofErr w:type="spellEnd"/>
       <w:r>
         <w:rPr>
           <w:sz w:val="20"/>
           <w:szCs w:val="20"/>
         </w:rPr>
-        <w:t>df</w:t>
-      </w:r>
-      <w:proofErr w:type="spellEnd"/>
+        <w:t>['</w:t>
+      </w:r>
+      <w:proofErr w:type="spellStart"/>
       <w:r>
         <w:rPr>
           <w:sz w:val="20"/>
           <w:szCs w:val="20"/>
         </w:rPr>
-        <w:t>['race'</w:t>
-      </w:r>
-      <w:proofErr w:type="gramStart"/>
+        <w:t>payer_code</w:t>
+      </w:r>
+      <w:proofErr w:type="spellEnd"/>
       <w:r>
         <w:rPr>
           <w:sz w:val="20"/>
           <w:szCs w:val="20"/>
         </w:rPr>
-        <w:t>].replace</w:t>
-      </w:r>
-      <w:proofErr w:type="gramEnd"/>
+        <w:t xml:space="preserve">'] = </w:t>
+      </w:r>
+      <w:proofErr w:type="spellStart"/>
       <w:r>
         <w:rPr>
           <w:sz w:val="20"/>
           <w:szCs w:val="20"/>
         </w:rPr>
-        <w:t>('?', 'Unknown')</w:t>
-      </w:r>
-    </w:p>
-    <w:p>
-      <w:pPr>
+        <w:t>df</w:t>
+      </w:r>
+      <w:proofErr w:type="spellEnd"/>
+      <w:r>
         <w:rPr>
           <w:sz w:val="20"/>
           <w:szCs w:val="20"/>
         </w:rPr>
-      </w:pPr>
+        <w:t>['</w:t>
+      </w:r>
       <w:proofErr w:type="spellStart"/>
       <w:r>
         <w:rPr>
           <w:sz w:val="20"/>
           <w:szCs w:val="20"/>
         </w:rPr>
-        <w:t>df</w:t>
+        <w:t>payer_code</w:t>
       </w:r>
       <w:proofErr w:type="spellEnd"/>
       <w:r>
@@ -5071,159 +5118,79 @@
           <w:sz w:val="20"/>
           <w:szCs w:val="20"/>
         </w:rPr>
-        <w:t>['</w:t>
-      </w:r>
-      <w:proofErr w:type="spellStart"/>
-      <w:r>
+        <w:t>'].replace('?', 'Unknown')</w:t>
+      </w:r>
+    </w:p>
+    <w:p>
+      <w:pPr>
         <w:rPr>
           <w:sz w:val="20"/>
           <w:szCs w:val="20"/>
         </w:rPr>
-        <w:t>payer_code</w:t>
-      </w:r>
-      <w:proofErr w:type="spellEnd"/>
+      </w:pPr>
+      <w:proofErr w:type="spellStart"/>
       <w:r>
         <w:rPr>
           <w:sz w:val="20"/>
           <w:szCs w:val="20"/>
         </w:rPr>
-        <w:t xml:space="preserve">'] = </w:t>
-      </w:r>
-      <w:proofErr w:type="spellStart"/>
+        <w:t>df</w:t>
+      </w:r>
+      <w:proofErr w:type="spellEnd"/>
       <w:r>
         <w:rPr>
           <w:sz w:val="20"/>
           <w:szCs w:val="20"/>
         </w:rPr>
-        <w:t>df</w:t>
-      </w:r>
-      <w:proofErr w:type="spellEnd"/>
+        <w:t>['</w:t>
+      </w:r>
+      <w:proofErr w:type="spellStart"/>
       <w:r>
         <w:rPr>
           <w:sz w:val="20"/>
           <w:szCs w:val="20"/>
         </w:rPr>
-        <w:t>['</w:t>
-      </w:r>
-      <w:proofErr w:type="spellStart"/>
+        <w:t>medical_specialty</w:t>
+      </w:r>
+      <w:proofErr w:type="spellEnd"/>
       <w:r>
         <w:rPr>
           <w:sz w:val="20"/>
           <w:szCs w:val="20"/>
         </w:rPr>
-        <w:t>payer_code</w:t>
-      </w:r>
-      <w:proofErr w:type="spellEnd"/>
+        <w:t xml:space="preserve">'] = </w:t>
+      </w:r>
+      <w:proofErr w:type="spellStart"/>
       <w:r>
         <w:rPr>
           <w:sz w:val="20"/>
           <w:szCs w:val="20"/>
         </w:rPr>
-        <w:t>'</w:t>
-      </w:r>
-      <w:proofErr w:type="gramStart"/>
+        <w:t>df</w:t>
+      </w:r>
+      <w:proofErr w:type="spellEnd"/>
       <w:r>
         <w:rPr>
           <w:sz w:val="20"/>
           <w:szCs w:val="20"/>
         </w:rPr>
-        <w:t>].replace</w:t>
-      </w:r>
-      <w:proofErr w:type="gramEnd"/>
+        <w:t>['</w:t>
+      </w:r>
+      <w:proofErr w:type="spellStart"/>
       <w:r>
         <w:rPr>
           <w:sz w:val="20"/>
           <w:szCs w:val="20"/>
         </w:rPr>
-        <w:t>('?', 'Unknown')</w:t>
-      </w:r>
-    </w:p>
-    <w:p>
-      <w:pPr>
+        <w:t>medical_specialty</w:t>
+      </w:r>
+      <w:proofErr w:type="spellEnd"/>
+      <w:r>
         <w:rPr>
           <w:sz w:val="20"/>
           <w:szCs w:val="20"/>
         </w:rPr>
-      </w:pPr>
-      <w:proofErr w:type="spellStart"/>
-      <w:r>
-        <w:rPr>
-          <w:sz w:val="20"/>
-          <w:szCs w:val="20"/>
-        </w:rPr>
-        <w:t>df</w:t>
-      </w:r>
-      <w:proofErr w:type="spellEnd"/>
-      <w:r>
-        <w:rPr>
-          <w:sz w:val="20"/>
-          <w:szCs w:val="20"/>
-        </w:rPr>
-        <w:t>['</w:t>
-      </w:r>
-      <w:proofErr w:type="spellStart"/>
-      <w:r>
-        <w:rPr>
-          <w:sz w:val="20"/>
-          <w:szCs w:val="20"/>
-        </w:rPr>
-        <w:t>medical_specialty</w:t>
-      </w:r>
-      <w:proofErr w:type="spellEnd"/>
-      <w:r>
-        <w:rPr>
-          <w:sz w:val="20"/>
-          <w:szCs w:val="20"/>
-        </w:rPr>
-        <w:t xml:space="preserve">'] = </w:t>
-      </w:r>
-      <w:proofErr w:type="spellStart"/>
-      <w:r>
-        <w:rPr>
-          <w:sz w:val="20"/>
-          <w:szCs w:val="20"/>
-        </w:rPr>
-        <w:t>df</w:t>
-      </w:r>
-      <w:proofErr w:type="spellEnd"/>
-      <w:r>
-        <w:rPr>
-          <w:sz w:val="20"/>
-          <w:szCs w:val="20"/>
-        </w:rPr>
-        <w:t>['</w:t>
-      </w:r>
-      <w:proofErr w:type="spellStart"/>
-      <w:r>
-        <w:rPr>
-          <w:sz w:val="20"/>
-          <w:szCs w:val="20"/>
-        </w:rPr>
-        <w:t>medical_specialty</w:t>
-      </w:r>
-      <w:proofErr w:type="spellEnd"/>
-      <w:r>
-        <w:rPr>
-          <w:sz w:val="20"/>
-          <w:szCs w:val="20"/>
-        </w:rPr>
-        <w:t>'</w:t>
-      </w:r>
-      <w:proofErr w:type="gramStart"/>
-      <w:r>
-        <w:rPr>
-          <w:sz w:val="20"/>
-          <w:szCs w:val="20"/>
-        </w:rPr>
-        <w:t>].replace</w:t>
-      </w:r>
-      <w:proofErr w:type="gramEnd"/>
-      <w:r>
-        <w:rPr>
-          <w:sz w:val="20"/>
-          <w:szCs w:val="20"/>
-        </w:rPr>
-        <w:t>('?', 'Unknown')</w:t>
+        <w:t>'].replace('?', 'Unknown')</w:t>
       </w:r>
     </w:p>
     <w:p>
@@ -5280,22 +5247,10 @@
           <w:b/>
           <w:bCs/>
         </w:rPr>
-        <w:t>&lt;</w:t>
-      </w:r>
-      <w:proofErr w:type="gramStart"/>
-      <w:r>
-        <w:rPr>
-          <w:b/>
-          <w:bCs/>
-        </w:rPr>
-        <w:t>30</w:t>
-      </w:r>
-      <w:r>
-        <w:t xml:space="preserve"> :</w:t>
-      </w:r>
-      <w:proofErr w:type="gramEnd"/>
-      <w:r>
-        <w:t xml:space="preserve"> Patient readmitted within 30 days</w:t>
+        <w:t>&lt;30</w:t>
+      </w:r>
+      <w:r>
+        <w:t xml:space="preserve"> : Patient readmitted within 30 days</w:t>
       </w:r>
     </w:p>
     <w:p>
@@ -5310,22 +5265,10 @@
           <w:b/>
           <w:bCs/>
         </w:rPr>
-        <w:t>&gt;</w:t>
-      </w:r>
-      <w:proofErr w:type="gramStart"/>
-      <w:r>
-        <w:rPr>
-          <w:b/>
-          <w:bCs/>
-        </w:rPr>
-        <w:t>30</w:t>
-      </w:r>
-      <w:r>
-        <w:t xml:space="preserve"> :</w:t>
-      </w:r>
-      <w:proofErr w:type="gramEnd"/>
-      <w:r>
-        <w:t xml:space="preserve"> Patient readmitted after 30 days</w:t>
+        <w:t>&gt;30</w:t>
+      </w:r>
+      <w:r>
+        <w:t xml:space="preserve"> : Patient readmitted after 30 days</w:t>
       </w:r>
     </w:p>
     <w:p>
@@ -5335,7 +5278,6 @@
           <w:numId w:val="12"/>
         </w:numPr>
       </w:pPr>
-      <w:proofErr w:type="gramStart"/>
       <w:r>
         <w:rPr>
           <w:b/>
@@ -5344,11 +5286,7 @@
         <w:t>NO</w:t>
       </w:r>
       <w:r>
-        <w:t xml:space="preserve"> :</w:t>
-      </w:r>
-      <w:proofErr w:type="gramEnd"/>
-      <w:r>
-        <w:t xml:space="preserve"> No readmission</w:t>
+        <w:t xml:space="preserve"> : No readmission</w:t>
       </w:r>
     </w:p>
     <w:p>
@@ -6430,7 +6368,6 @@
         <w:t xml:space="preserve"> = </w:t>
       </w:r>
       <w:proofErr w:type="spellStart"/>
-      <w:proofErr w:type="gramStart"/>
       <w:r>
         <w:rPr>
           <w:sz w:val="20"/>
@@ -6447,7 +6384,6 @@
         <w:t>(</w:t>
       </w:r>
       <w:proofErr w:type="spellStart"/>
-      <w:proofErr w:type="gramEnd"/>
       <w:r>
         <w:rPr>
           <w:sz w:val="20"/>
@@ -6989,120 +6925,86 @@
         <w:t xml:space="preserve"> = </w:t>
       </w:r>
       <w:proofErr w:type="spellStart"/>
-      <w:proofErr w:type="gramStart"/>
       <w:r>
         <w:rPr>
           <w:sz w:val="20"/>
           <w:szCs w:val="20"/>
         </w:rPr>
-        <w:t>lr.predict</w:t>
-      </w:r>
-      <w:proofErr w:type="gramEnd"/>
+        <w:t>lr.predict_proba</w:t>
+      </w:r>
+      <w:proofErr w:type="spellEnd"/>
       <w:r>
         <w:rPr>
           <w:sz w:val="20"/>
           <w:szCs w:val="20"/>
         </w:rPr>
-        <w:t>_proba</w:t>
-      </w:r>
-      <w:proofErr w:type="spellEnd"/>
+        <w:t>(</w:t>
+      </w:r>
+      <w:proofErr w:type="spellStart"/>
       <w:r>
         <w:rPr>
           <w:sz w:val="20"/>
           <w:szCs w:val="20"/>
         </w:rPr>
-        <w:t>(</w:t>
-      </w:r>
-      <w:proofErr w:type="spellStart"/>
+        <w:t>X_test</w:t>
+      </w:r>
+      <w:proofErr w:type="spellEnd"/>
       <w:r>
         <w:rPr>
           <w:sz w:val="20"/>
           <w:szCs w:val="20"/>
         </w:rPr>
-        <w:t>X_</w:t>
-      </w:r>
-      <w:proofErr w:type="gramStart"/>
-      <w:r>
+        <w:t>)[:,1]</w:t>
+      </w:r>
+    </w:p>
+    <w:p>
+      <w:pPr>
         <w:rPr>
           <w:sz w:val="20"/>
           <w:szCs w:val="20"/>
         </w:rPr>
-        <w:t>test</w:t>
-      </w:r>
-      <w:proofErr w:type="spellEnd"/>
+      </w:pPr>
+      <w:proofErr w:type="spellStart"/>
       <w:r>
         <w:rPr>
           <w:sz w:val="20"/>
           <w:szCs w:val="20"/>
         </w:rPr>
-        <w:t>)[:,</w:t>
-      </w:r>
-      <w:proofErr w:type="gramEnd"/>
+        <w:t>y_pred</w:t>
+      </w:r>
+      <w:proofErr w:type="spellEnd"/>
       <w:r>
         <w:rPr>
           <w:sz w:val="20"/>
           <w:szCs w:val="20"/>
         </w:rPr>
-        <w:t>1]</w:t>
-      </w:r>
-    </w:p>
-    <w:p>
-      <w:pPr>
+        <w:t xml:space="preserve"> = (</w:t>
+      </w:r>
+      <w:proofErr w:type="spellStart"/>
+      <w:r>
         <w:rPr>
           <w:sz w:val="20"/>
           <w:szCs w:val="20"/>
         </w:rPr>
-      </w:pPr>
-      <w:proofErr w:type="spellStart"/>
+        <w:t>y_prob</w:t>
+      </w:r>
+      <w:proofErr w:type="spellEnd"/>
       <w:r>
         <w:rPr>
           <w:sz w:val="20"/>
           <w:szCs w:val="20"/>
         </w:rPr>
-        <w:t>y_pred</w:t>
-      </w:r>
-      <w:proofErr w:type="spellEnd"/>
+        <w:t xml:space="preserve"> &gt;= threshold).</w:t>
+      </w:r>
+      <w:proofErr w:type="spellStart"/>
       <w:r>
         <w:rPr>
           <w:sz w:val="20"/>
           <w:szCs w:val="20"/>
         </w:rPr>
-        <w:t xml:space="preserve"> = (</w:t>
-      </w:r>
-      <w:proofErr w:type="spellStart"/>
-      <w:r>
-        <w:rPr>
-          <w:sz w:val="20"/>
-          <w:szCs w:val="20"/>
-        </w:rPr>
-        <w:t>y_prob</w:t>
+        <w:t>astype</w:t>
       </w:r>
       <w:proofErr w:type="spellEnd"/>
-      <w:r>
-        <w:rPr>
-          <w:sz w:val="20"/>
-          <w:szCs w:val="20"/>
-        </w:rPr>
-        <w:t xml:space="preserve"> &gt;= threshold</w:t>
-      </w:r>
-      <w:proofErr w:type="gramStart"/>
-      <w:r>
-        <w:rPr>
-          <w:sz w:val="20"/>
-          <w:szCs w:val="20"/>
-        </w:rPr>
-        <w:t>).</w:t>
-      </w:r>
-      <w:proofErr w:type="spellStart"/>
-      <w:r>
-        <w:rPr>
-          <w:sz w:val="20"/>
-          <w:szCs w:val="20"/>
-        </w:rPr>
-        <w:t>astype</w:t>
-      </w:r>
-      <w:proofErr w:type="spellEnd"/>
-      <w:proofErr w:type="gramEnd"/>
       <w:r>
         <w:rPr>
           <w:sz w:val="20"/>
@@ -7267,30 +7169,14 @@
           <w:b/>
           <w:bCs/>
         </w:rPr>
-        <w:t xml:space="preserve">MODEL </w:t>
-      </w:r>
-      <w:proofErr w:type="gramStart"/>
-      <w:r>
-        <w:rPr>
-          <w:b/>
-          <w:bCs/>
-        </w:rPr>
-        <w:t>CONFIGURATION</w:t>
-      </w:r>
-      <w:r>
-        <w:rPr>
-          <w:b/>
-          <w:bCs/>
-        </w:rPr>
-        <w:t xml:space="preserve"> :</w:t>
-      </w:r>
-      <w:proofErr w:type="gramEnd"/>
-      <w:r>
-        <w:rPr>
-          <w:b/>
-          <w:bCs/>
-        </w:rPr>
-        <w:t xml:space="preserve"> </w:t>
+        <w:t>MODEL CONFIGURATION</w:t>
+      </w:r>
+      <w:r>
+        <w:rPr>
+          <w:b/>
+          <w:bCs/>
+        </w:rPr>
+        <w:t xml:space="preserve"> : </w:t>
       </w:r>
       <w:r>
         <w:t>The model was trained using default parameters without additional optimization.</w:t>
@@ -7326,7 +7212,6 @@
         <w:t xml:space="preserve">dt = </w:t>
       </w:r>
       <w:proofErr w:type="spellStart"/>
-      <w:proofErr w:type="gramStart"/>
       <w:r>
         <w:rPr>
           <w:sz w:val="20"/>
@@ -7343,7 +7228,6 @@
         <w:t>(</w:t>
       </w:r>
       <w:proofErr w:type="spellStart"/>
-      <w:proofErr w:type="gramEnd"/>
       <w:r>
         <w:rPr>
           <w:sz w:val="20"/>
@@ -7772,7 +7656,6 @@
         <w:t xml:space="preserve">rf = </w:t>
       </w:r>
       <w:proofErr w:type="spellStart"/>
-      <w:proofErr w:type="gramStart"/>
       <w:r>
         <w:rPr>
           <w:sz w:val="20"/>
@@ -7789,7 +7672,6 @@
         <w:t>(</w:t>
       </w:r>
       <w:proofErr w:type="spellStart"/>
-      <w:proofErr w:type="gramEnd"/>
       <w:r>
         <w:rPr>
           <w:sz w:val="20"/>
@@ -7819,47 +7701,15 @@
           <w:sz w:val="20"/>
           <w:szCs w:val="20"/>
         </w:rPr>
-        <w:t xml:space="preserve"> = </w:t>
-      </w:r>
-      <w:proofErr w:type="gramStart"/>
+        <w:t xml:space="preserve"> = 42,class_weight = 'balanced',</w:t>
+      </w:r>
+      <w:proofErr w:type="spellStart"/>
       <w:r>
         <w:rPr>
           <w:sz w:val="20"/>
           <w:szCs w:val="20"/>
         </w:rPr>
-        <w:t>42,class</w:t>
-      </w:r>
-      <w:proofErr w:type="gramEnd"/>
-      <w:r>
-        <w:rPr>
-          <w:sz w:val="20"/>
-          <w:szCs w:val="20"/>
-        </w:rPr>
-        <w:t>_weight = 'balanced</w:t>
-      </w:r>
-      <w:proofErr w:type="gramStart"/>
-      <w:r>
-        <w:rPr>
-          <w:sz w:val="20"/>
-          <w:szCs w:val="20"/>
-        </w:rPr>
-        <w:t>',</w:t>
-      </w:r>
-      <w:proofErr w:type="spellStart"/>
-      <w:r>
-        <w:rPr>
-          <w:sz w:val="20"/>
-          <w:szCs w:val="20"/>
-        </w:rPr>
-        <w:t>n</w:t>
-      </w:r>
-      <w:proofErr w:type="gramEnd"/>
-      <w:r>
-        <w:rPr>
-          <w:sz w:val="20"/>
-          <w:szCs w:val="20"/>
-        </w:rPr>
-        <w:t>_jobs</w:t>
+        <w:t>n_jobs</w:t>
       </w:r>
       <w:proofErr w:type="spellEnd"/>
       <w:r>
@@ -8401,56 +8251,14 @@
       <w:r>
         <w:t xml:space="preserve"> </w:t>
       </w:r>
-      <w:proofErr w:type="gramStart"/>
-      <w:r>
-        <w:t>RandomForestClassifier(</w:t>
-      </w:r>
-      <w:proofErr w:type="gramEnd"/>
-      <w:r>
-        <w:t>n_estimators=</w:t>
-      </w:r>
-      <w:proofErr w:type="gramStart"/>
-      <w:r>
-        <w:t>200,max</w:t>
-      </w:r>
-      <w:proofErr w:type="gramEnd"/>
-      <w:r>
-        <w:t>_depth=</w:t>
-      </w:r>
-      <w:proofErr w:type="gramStart"/>
-      <w:r>
-        <w:t>10,min</w:t>
-      </w:r>
-      <w:proofErr w:type="gramEnd"/>
-      <w:r>
-        <w:t>_samples_leaf=</w:t>
-      </w:r>
-      <w:proofErr w:type="gramStart"/>
-      <w:r>
-        <w:t>20,clas</w:t>
+      <w:r>
+        <w:t>RandomForestClassifier(n_estimators=200,max_depth=10,min_samples_leaf=20,clas</w:t>
       </w:r>
       <w:r>
         <w:t>s</w:t>
       </w:r>
-      <w:proofErr w:type="gramEnd"/>
-      <w:r>
-        <w:t>_weight='balanced</w:t>
-      </w:r>
-      <w:proofErr w:type="gramStart"/>
-      <w:r>
-        <w:t>',random</w:t>
-      </w:r>
-      <w:proofErr w:type="gramEnd"/>
-      <w:r>
-        <w:t>_state=</w:t>
-      </w:r>
-      <w:proofErr w:type="gramStart"/>
-      <w:r>
-        <w:t>42,n</w:t>
-      </w:r>
-      <w:proofErr w:type="gramEnd"/>
-      <w:r>
-        <w:t>_jobs = -1)</w:t>
+      <w:r>
+        <w:t>_weight='balanced',random_state=42,n_jobs = -1)</w:t>
       </w:r>
     </w:p>
     <w:p>
@@ -11035,9 +10843,14 @@
       </w:r>
     </w:p>
     <w:p>
-      <w:r>
-        <w:t>[Insert LinkedIn Post URL]</w:t>
-      </w:r>
+      <w:hyperlink r:id="rId20" w:history="1">
+        <w:r>
+          <w:rPr>
+            <w:rStyle w:val="Hyperlink"/>
+          </w:rPr>
+          <w:t>Linkedin</w:t>
+        </w:r>
+      </w:hyperlink>
     </w:p>
     <w:p/>
     <w:p>

</xml_diff>